<commit_message>
Update Arb study notes for 2026-08-28 release
</commit_message>
<xml_diff>
--- a/arb/docx/08.content.docx
+++ b/arb/docx/08.content.docx
@@ -376,20 +376,14 @@
         </w:rPr>
         <w:t xml:space="preserve">لقد كان الأفراتيون من عشيرة أفراتة، والتي تمركزت في بيت لحم في يهوذا (انظر </w:t>
       </w:r>
-      <w:hyperlink r:id="rId13">
-        <w:r>
-          <w:rPr>
-            <w:rtl/>
-            <w:cs/>
-            <w:lang w:val="ar_AE" w:bidi="ar_AE"/>
-          </w:rPr>
-          <w:rPr>
-            <w:color w:val="0000EE"/>
-            <w:u w:val="single"/>
-          </w:rPr>
-          <w:t>تك 19:35</w:t>
-        </w:r>
-      </w:hyperlink>
+      <w:r>
+        <w:rPr>
+          <w:rtl/>
+          <w:cs/>
+          <w:lang w:val="ar_AE" w:bidi="ar_AE"/>
+        </w:rPr>
+        <w:t>تك 19:35</w:t>
+      </w:r>
       <w:r>
         <w:rPr>
           <w:rtl/>
@@ -398,20 +392,14 @@
         </w:rPr>
         <w:t xml:space="preserve">; </w:t>
       </w:r>
-      <w:hyperlink r:id="rId14">
-        <w:r>
-          <w:rPr>
-            <w:rtl/>
-            <w:cs/>
-            <w:lang w:val="ar_AE" w:bidi="ar_AE"/>
-          </w:rPr>
-          <w:rPr>
-            <w:color w:val="0000EE"/>
-            <w:u w:val="single"/>
-          </w:rPr>
-          <w:t>أخبار الأيام الأول 4:4</w:t>
-        </w:r>
-      </w:hyperlink>
+      <w:r>
+        <w:rPr>
+          <w:rtl/>
+          <w:cs/>
+          <w:lang w:val="ar_AE" w:bidi="ar_AE"/>
+        </w:rPr>
+        <w:t>أخبار الأيام الأول 4:4</w:t>
+      </w:r>
       <w:r>
         <w:rPr>
           <w:rtl/>
@@ -487,20 +475,14 @@
         </w:rPr>
         <w:t xml:space="preserve">لقد تزوج كليون ... من عرفة؛ بينما تزوج محلون براعوث (انظر </w:t>
       </w:r>
-      <w:hyperlink r:id="rId15">
-        <w:r>
-          <w:rPr>
-            <w:rtl/>
-            <w:cs/>
-            <w:lang w:val="ar_AE" w:bidi="ar_AE"/>
-          </w:rPr>
-          <w:rPr>
-            <w:color w:val="0000EE"/>
-            <w:u w:val="single"/>
-          </w:rPr>
-          <w:t>10:4</w:t>
-        </w:r>
-      </w:hyperlink>
+      <w:r>
+        <w:rPr>
+          <w:rtl/>
+          <w:cs/>
+          <w:lang w:val="ar_AE" w:bidi="ar_AE"/>
+        </w:rPr>
+        <w:t>10:4</w:t>
+      </w:r>
       <w:r>
         <w:rPr>
           <w:rtl/>
@@ -660,20 +642,14 @@
         </w:rPr>
         <w:t xml:space="preserve">ليعطيهم: الكلمة المُستخدم هنا هي نفس الفعل العبري في </w:t>
       </w:r>
-      <w:hyperlink r:id="rId16">
-        <w:r>
-          <w:rPr>
-            <w:rtl/>
-            <w:cs/>
-            <w:lang w:val="ar_AE" w:bidi="ar_AE"/>
-          </w:rPr>
-          <w:rPr>
-            <w:color w:val="0000EE"/>
-            <w:u w:val="single"/>
-          </w:rPr>
-          <w:t xml:space="preserve">13:4 </w:t>
-        </w:r>
-      </w:hyperlink>
+      <w:r>
+        <w:rPr>
+          <w:rtl/>
+          <w:cs/>
+          <w:lang w:val="ar_AE" w:bidi="ar_AE"/>
+        </w:rPr>
+        <w:t xml:space="preserve">13:4 </w:t>
+      </w:r>
       <w:r>
         <w:rPr>
           <w:rtl/>
@@ -883,20 +859,14 @@
         </w:rPr>
         <w:t>أمّا راعوث فلصقت بنعمي: إن الفعل العبري المستخدم هنا يؤكد على قوة محبة راعوث لحماتها؛ إنها نفس الكلمة المستخدمة لوصف "اتحاد أو التصاق" رجل بزوجته (</w:t>
       </w:r>
-      <w:hyperlink r:id="rId17">
-        <w:r>
-          <w:rPr>
-            <w:rtl/>
-            <w:cs/>
-            <w:lang w:val="ar_AE" w:bidi="ar_AE"/>
-          </w:rPr>
-          <w:rPr>
-            <w:color w:val="0000EE"/>
-            <w:u w:val="single"/>
-          </w:rPr>
-          <w:t>تك 24:2</w:t>
-        </w:r>
-      </w:hyperlink>
+      <w:r>
+        <w:rPr>
+          <w:rtl/>
+          <w:cs/>
+          <w:lang w:val="ar_AE" w:bidi="ar_AE"/>
+        </w:rPr>
+        <w:t>تك 24:2</w:t>
+      </w:r>
       <w:r>
         <w:rPr>
           <w:rtl/>
@@ -905,20 +875,14 @@
         </w:rPr>
         <w:t>)، كما إنها تستخدم للتعبير عن شخص قد استمر مخلصًا للرب (</w:t>
       </w:r>
-      <w:hyperlink r:id="rId18">
-        <w:r>
-          <w:rPr>
-            <w:rtl/>
-            <w:cs/>
-            <w:lang w:val="ar_AE" w:bidi="ar_AE"/>
-          </w:rPr>
-          <w:rPr>
-            <w:color w:val="0000EE"/>
-            <w:u w:val="single"/>
-          </w:rPr>
-          <w:t>تث 4:4</w:t>
-        </w:r>
-      </w:hyperlink>
+      <w:r>
+        <w:rPr>
+          <w:rtl/>
+          <w:cs/>
+          <w:lang w:val="ar_AE" w:bidi="ar_AE"/>
+        </w:rPr>
+        <w:t>تث 4:4</w:t>
+      </w:r>
       <w:r>
         <w:rPr>
           <w:rtl/>
@@ -927,20 +891,14 @@
         </w:rPr>
         <w:t xml:space="preserve">; </w:t>
       </w:r>
-      <w:hyperlink r:id="rId19">
-        <w:r>
-          <w:rPr>
-            <w:rtl/>
-            <w:cs/>
-            <w:lang w:val="ar_AE" w:bidi="ar_AE"/>
-          </w:rPr>
-          <w:rPr>
-            <w:color w:val="0000EE"/>
-            <w:u w:val="single"/>
-          </w:rPr>
-          <w:t>20:10</w:t>
-        </w:r>
-      </w:hyperlink>
+      <w:r>
+        <w:rPr>
+          <w:rtl/>
+          <w:cs/>
+          <w:lang w:val="ar_AE" w:bidi="ar_AE"/>
+        </w:rPr>
+        <w:t>20:10</w:t>
+      </w:r>
       <w:r>
         <w:rPr>
           <w:rtl/>
@@ -949,20 +907,14 @@
         </w:rPr>
         <w:t xml:space="preserve">; </w:t>
       </w:r>
-      <w:hyperlink r:id="rId20">
-        <w:r>
-          <w:rPr>
-            <w:rtl/>
-            <w:cs/>
-            <w:lang w:val="ar_AE" w:bidi="ar_AE"/>
-          </w:rPr>
-          <w:rPr>
-            <w:color w:val="0000EE"/>
-            <w:u w:val="single"/>
-          </w:rPr>
-          <w:t>يش 5:22</w:t>
-        </w:r>
-      </w:hyperlink>
+      <w:r>
+        <w:rPr>
+          <w:rtl/>
+          <w:cs/>
+          <w:lang w:val="ar_AE" w:bidi="ar_AE"/>
+        </w:rPr>
+        <w:t>يش 5:22</w:t>
+      </w:r>
       <w:r>
         <w:rPr>
           <w:rtl/>
@@ -1105,20 +1057,14 @@
         </w:rPr>
         <w:t xml:space="preserve">لفد تعهدّت راعوث بقسم بإسم الرب بأن تحافظ على التزامها الثابت نحو إله إسرائيل (انظر </w:t>
       </w:r>
-      <w:hyperlink r:id="rId21">
-        <w:r>
-          <w:rPr>
-            <w:rtl/>
-            <w:cs/>
-            <w:lang w:val="ar_AE" w:bidi="ar_AE"/>
-          </w:rPr>
-          <w:rPr>
-            <w:color w:val="0000EE"/>
-            <w:u w:val="single"/>
-          </w:rPr>
-          <w:t>11:2–12</w:t>
-        </w:r>
-      </w:hyperlink>
+      <w:r>
+        <w:rPr>
+          <w:rtl/>
+          <w:cs/>
+          <w:lang w:val="ar_AE" w:bidi="ar_AE"/>
+        </w:rPr>
+        <w:t>11:2–12</w:t>
+      </w:r>
       <w:r>
         <w:rPr>
           <w:rtl/>
@@ -1194,20 +1140,14 @@
         </w:rPr>
         <w:t xml:space="preserve">إن كلمة القدير هي ترجمة للكلمة العبرية شدّاي، والتي تصور قوة الله ورعايته. لقد كانت شكوى نعمي حقيقية، ولكن الله دبّر تمامًا ما كانت تحتاج إليه (انظر </w:t>
       </w:r>
-      <w:hyperlink r:id="rId22">
-        <w:r>
-          <w:rPr>
-            <w:rtl/>
-            <w:cs/>
-            <w:lang w:val="ar_AE" w:bidi="ar_AE"/>
-          </w:rPr>
-          <w:rPr>
-            <w:color w:val="0000EE"/>
-            <w:u w:val="single"/>
-          </w:rPr>
-          <w:t>14:4–17</w:t>
-        </w:r>
-      </w:hyperlink>
+      <w:r>
+        <w:rPr>
+          <w:rtl/>
+          <w:cs/>
+          <w:lang w:val="ar_AE" w:bidi="ar_AE"/>
+        </w:rPr>
+        <w:t>14:4–17</w:t>
+      </w:r>
       <w:r>
         <w:rPr>
           <w:rtl/>
@@ -1433,20 +1373,14 @@
         </w:rPr>
         <w:t xml:space="preserve">التقط سنابل الحبوب المتبقية: كان يجب على الحصادين ترك بعض السنابل للفقراء كي يلتقطوها (انظر </w:t>
       </w:r>
-      <w:hyperlink r:id="rId23">
-        <w:r>
-          <w:rPr>
-            <w:rtl/>
-            <w:cs/>
-            <w:lang w:val="ar_AE" w:bidi="ar_AE"/>
-          </w:rPr>
-          <w:rPr>
-            <w:color w:val="0000EE"/>
-            <w:u w:val="single"/>
-          </w:rPr>
-          <w:t>لاويين 9:19–10</w:t>
-        </w:r>
-      </w:hyperlink>
+      <w:r>
+        <w:rPr>
+          <w:rtl/>
+          <w:cs/>
+          <w:lang w:val="ar_AE" w:bidi="ar_AE"/>
+        </w:rPr>
+        <w:t>لاويين 9:19–10</w:t>
+      </w:r>
       <w:r>
         <w:rPr>
           <w:rtl/>
@@ -1455,20 +1389,14 @@
         </w:rPr>
         <w:t xml:space="preserve">; </w:t>
       </w:r>
-      <w:hyperlink r:id="rId24">
-        <w:r>
-          <w:rPr>
-            <w:rtl/>
-            <w:cs/>
-            <w:lang w:val="ar_AE" w:bidi="ar_AE"/>
-          </w:rPr>
-          <w:rPr>
-            <w:color w:val="0000EE"/>
-            <w:u w:val="single"/>
-          </w:rPr>
-          <w:t>22:23</w:t>
-        </w:r>
-      </w:hyperlink>
+      <w:r>
+        <w:rPr>
+          <w:rtl/>
+          <w:cs/>
+          <w:lang w:val="ar_AE" w:bidi="ar_AE"/>
+        </w:rPr>
+        <w:t>22:23</w:t>
+      </w:r>
       <w:r>
         <w:rPr>
           <w:rtl/>
@@ -1477,20 +1405,14 @@
         </w:rPr>
         <w:t xml:space="preserve">; </w:t>
       </w:r>
-      <w:hyperlink r:id="rId25">
-        <w:r>
-          <w:rPr>
-            <w:rtl/>
-            <w:cs/>
-            <w:lang w:val="ar_AE" w:bidi="ar_AE"/>
-          </w:rPr>
-          <w:rPr>
-            <w:color w:val="0000EE"/>
-            <w:u w:val="single"/>
-          </w:rPr>
-          <w:t>تثنية 19:24–22</w:t>
-        </w:r>
-      </w:hyperlink>
+      <w:r>
+        <w:rPr>
+          <w:rtl/>
+          <w:cs/>
+          <w:lang w:val="ar_AE" w:bidi="ar_AE"/>
+        </w:rPr>
+        <w:t>تثنية 19:24–22</w:t>
+      </w:r>
       <w:r>
         <w:rPr>
           <w:rtl/>
@@ -2253,20 +2175,14 @@
         </w:rPr>
         <w:t>إن الكاتب يشير إلى راعوث باسم "راعوث الموآبية" خمس مرات (</w:t>
       </w:r>
-      <w:hyperlink r:id="rId26">
-        <w:r>
-          <w:rPr>
-            <w:rtl/>
-            <w:cs/>
-            <w:lang w:val="ar_AE" w:bidi="ar_AE"/>
-          </w:rPr>
-          <w:rPr>
-            <w:color w:val="0000EE"/>
-            <w:u w:val="single"/>
-          </w:rPr>
-          <w:t>22:1</w:t>
-        </w:r>
-      </w:hyperlink>
+      <w:r>
+        <w:rPr>
+          <w:rtl/>
+          <w:cs/>
+          <w:lang w:val="ar_AE" w:bidi="ar_AE"/>
+        </w:rPr>
+        <w:t>22:1</w:t>
+      </w:r>
       <w:r>
         <w:rPr>
           <w:rtl/>
@@ -2275,20 +2191,14 @@
         </w:rPr>
         <w:t xml:space="preserve">; </w:t>
       </w:r>
-      <w:hyperlink r:id="rId27">
-        <w:r>
-          <w:rPr>
-            <w:rtl/>
-            <w:cs/>
-            <w:lang w:val="ar_AE" w:bidi="ar_AE"/>
-          </w:rPr>
-          <w:rPr>
-            <w:color w:val="0000EE"/>
-            <w:u w:val="single"/>
-          </w:rPr>
-          <w:t>2:2</w:t>
-        </w:r>
-      </w:hyperlink>
+      <w:r>
+        <w:rPr>
+          <w:rtl/>
+          <w:cs/>
+          <w:lang w:val="ar_AE" w:bidi="ar_AE"/>
+        </w:rPr>
+        <w:t>2:2</w:t>
+      </w:r>
       <w:r>
         <w:rPr>
           <w:rtl/>
@@ -2297,20 +2207,14 @@
         </w:rPr>
         <w:t xml:space="preserve">, </w:t>
       </w:r>
-      <w:hyperlink r:id="rId28">
-        <w:r>
-          <w:rPr>
-            <w:rtl/>
-            <w:cs/>
-            <w:lang w:val="ar_AE" w:bidi="ar_AE"/>
-          </w:rPr>
-          <w:rPr>
-            <w:color w:val="0000EE"/>
-            <w:u w:val="single"/>
-          </w:rPr>
-          <w:t>21</w:t>
-        </w:r>
-      </w:hyperlink>
+      <w:r>
+        <w:rPr>
+          <w:rtl/>
+          <w:cs/>
+          <w:lang w:val="ar_AE" w:bidi="ar_AE"/>
+        </w:rPr>
+        <w:t>21</w:t>
+      </w:r>
       <w:r>
         <w:rPr>
           <w:rtl/>
@@ -2319,20 +2223,14 @@
         </w:rPr>
         <w:t xml:space="preserve">; </w:t>
       </w:r>
-      <w:hyperlink r:id="rId29">
-        <w:r>
-          <w:rPr>
-            <w:rtl/>
-            <w:cs/>
-            <w:lang w:val="ar_AE" w:bidi="ar_AE"/>
-          </w:rPr>
-          <w:rPr>
-            <w:color w:val="0000EE"/>
-            <w:u w:val="single"/>
-          </w:rPr>
-          <w:t>5:4</w:t>
-        </w:r>
-      </w:hyperlink>
+      <w:r>
+        <w:rPr>
+          <w:rtl/>
+          <w:cs/>
+          <w:lang w:val="ar_AE" w:bidi="ar_AE"/>
+        </w:rPr>
+        <w:t>5:4</w:t>
+      </w:r>
       <w:r>
         <w:rPr>
           <w:rtl/>
@@ -2341,20 +2239,14 @@
         </w:rPr>
         <w:t xml:space="preserve">, </w:t>
       </w:r>
-      <w:hyperlink r:id="rId15">
-        <w:r>
-          <w:rPr>
-            <w:rtl/>
-            <w:cs/>
-            <w:lang w:val="ar_AE" w:bidi="ar_AE"/>
-          </w:rPr>
-          <w:rPr>
-            <w:color w:val="0000EE"/>
-            <w:u w:val="single"/>
-          </w:rPr>
-          <w:t>10</w:t>
-        </w:r>
-      </w:hyperlink>
+      <w:r>
+        <w:rPr>
+          <w:rtl/>
+          <w:cs/>
+          <w:lang w:val="ar_AE" w:bidi="ar_AE"/>
+        </w:rPr>
+        <w:t>10</w:t>
+      </w:r>
       <w:r>
         <w:rPr>
           <w:rtl/>
@@ -2447,20 +2339,14 @@
         </w:rPr>
         <w:t xml:space="preserve">): استخدمت نعمي تعبيرًا مشابهًا عندما صلّت لراعوث وعرفة في </w:t>
       </w:r>
-      <w:hyperlink r:id="rId30">
-        <w:r>
-          <w:rPr>
-            <w:rtl/>
-            <w:cs/>
-            <w:lang w:val="ar_AE" w:bidi="ar_AE"/>
-          </w:rPr>
-          <w:rPr>
-            <w:color w:val="0000EE"/>
-            <w:u w:val="single"/>
-          </w:rPr>
-          <w:t>1:9</w:t>
-        </w:r>
-      </w:hyperlink>
+      <w:r>
+        <w:rPr>
+          <w:rtl/>
+          <w:cs/>
+          <w:lang w:val="ar_AE" w:bidi="ar_AE"/>
+        </w:rPr>
+        <w:t>1:9</w:t>
+      </w:r>
       <w:r>
         <w:rPr>
           <w:rtl/>
@@ -2945,20 +2831,14 @@
         </w:rPr>
         <w:t xml:space="preserve">أَمَتُك: تعمّدت راعوث أن تكون مثل باقي النساء العاملات في الحقل. • ٱبْسُطْ ذَيْلَ ثَوْبِكَ عَلَى أَمَتِك: ما فعلته راعوث كان طريقتها في التعبير عن رغبتها في أن يتزوجها بوعز (قارن </w:t>
       </w:r>
-      <w:hyperlink r:id="rId31">
-        <w:r>
-          <w:rPr>
-            <w:rtl/>
-            <w:cs/>
-            <w:lang w:val="ar_AE" w:bidi="ar_AE"/>
-          </w:rPr>
-          <w:rPr>
-            <w:color w:val="0000EE"/>
-            <w:u w:val="single"/>
-          </w:rPr>
-          <w:t>حزقيال 16:8</w:t>
-        </w:r>
-      </w:hyperlink>
+      <w:r>
+        <w:rPr>
+          <w:rtl/>
+          <w:cs/>
+          <w:lang w:val="ar_AE" w:bidi="ar_AE"/>
+        </w:rPr>
+        <w:t>حزقيال 16:8</w:t>
+      </w:r>
       <w:r>
         <w:rPr>
           <w:rtl/>
@@ -2967,20 +2847,14 @@
         </w:rPr>
         <w:t xml:space="preserve">). • راعوث ناشدت بوعز بصفته وليّ العائلة (بالعبرية جآل) لإقناعه بالزواج منها (انظر </w:t>
       </w:r>
-      <w:hyperlink r:id="rId29">
-        <w:r>
-          <w:rPr>
-            <w:rtl/>
-            <w:cs/>
-            <w:lang w:val="ar_AE" w:bidi="ar_AE"/>
-          </w:rPr>
-          <w:rPr>
-            <w:color w:val="0000EE"/>
-            <w:u w:val="single"/>
-          </w:rPr>
-          <w:t>راعوث 4:5</w:t>
-        </w:r>
-      </w:hyperlink>
+      <w:r>
+        <w:rPr>
+          <w:rtl/>
+          <w:cs/>
+          <w:lang w:val="ar_AE" w:bidi="ar_AE"/>
+        </w:rPr>
+        <w:t>راعوث 4:5</w:t>
+      </w:r>
       <w:r>
         <w:rPr>
           <w:rtl/>
@@ -3072,20 +2946,14 @@
         </w:rPr>
         <w:t xml:space="preserve">أَحْسَنْتِ مَعْرُوفَكِ فِي ٱلْأَخِيرِ أَكْثَرَ مِنَ ٱلْأَوَّلِ: لم تكن راعوث مجبَرة على العودة مع نعمي إلى بيت لحم، ولا كان واجبًا عليها الزواج داخل عائلة أليمالك أو أن تُحاول أن تقيم لهم نسلًا يرث الأرض (انظر </w:t>
       </w:r>
-      <w:hyperlink r:id="rId29">
-        <w:r>
-          <w:rPr>
-            <w:rtl/>
-            <w:cs/>
-            <w:lang w:val="ar_AE" w:bidi="ar_AE"/>
-          </w:rPr>
-          <w:rPr>
-            <w:color w:val="0000EE"/>
-            <w:u w:val="single"/>
-          </w:rPr>
-          <w:t>4:5</w:t>
-        </w:r>
-      </w:hyperlink>
+      <w:r>
+        <w:rPr>
+          <w:rtl/>
+          <w:cs/>
+          <w:lang w:val="ar_AE" w:bidi="ar_AE"/>
+        </w:rPr>
+        <w:t>4:5</w:t>
+      </w:r>
       <w:r>
         <w:rPr>
           <w:rtl/>
@@ -3177,20 +3045,14 @@
         </w:rPr>
         <w:t>); بينما يعتقد أغلب المفسرين أن بوعز كان يريد توفير الحماية والمعونة لراعوث ونعمي، ولذلك قرر أن يمنح القريب الأقرب فرصة أولًا ليقوم بدور الفادي، قبل أن يتولّى هو الأمر بنفسه (</w:t>
       </w:r>
-      <w:hyperlink r:id="rId32">
-        <w:r>
-          <w:rPr>
-            <w:rtl/>
-            <w:cs/>
-            <w:lang w:val="ar_AE" w:bidi="ar_AE"/>
-          </w:rPr>
-          <w:rPr>
-            <w:color w:val="0000EE"/>
-            <w:u w:val="single"/>
-          </w:rPr>
-          <w:t>4:1–12</w:t>
-        </w:r>
-      </w:hyperlink>
+      <w:r>
+        <w:rPr>
+          <w:rtl/>
+          <w:cs/>
+          <w:lang w:val="ar_AE" w:bidi="ar_AE"/>
+        </w:rPr>
+        <w:t>4:1–12</w:t>
+      </w:r>
       <w:r>
         <w:rPr>
           <w:rtl/>
@@ -3341,20 +3203,14 @@
         </w:rPr>
         <w:t>: كان هناك نوعان من المكيال: الأول صغير يُسمى عُمر، ويساوي تقريبًا 2 لتر، والثاني أكبر، يُدعى صاع، ويساوي حوالي 6.5 لتر. ومن المرجّح أن بوعز أعطى راعوث الكمية الأكبر، وهو تصرف يُظهر كرمًا واضحًا، لأن الكمية كانت ضعف ما جمعته في يومها الأول من العمل (</w:t>
       </w:r>
-      <w:hyperlink r:id="rId33">
-        <w:r>
-          <w:rPr>
-            <w:rtl/>
-            <w:cs/>
-            <w:lang w:val="ar_AE" w:bidi="ar_AE"/>
-          </w:rPr>
-          <w:rPr>
-            <w:color w:val="0000EE"/>
-            <w:u w:val="single"/>
-          </w:rPr>
-          <w:t>2:17</w:t>
-        </w:r>
-      </w:hyperlink>
+      <w:r>
+        <w:rPr>
+          <w:rtl/>
+          <w:cs/>
+          <w:lang w:val="ar_AE" w:bidi="ar_AE"/>
+        </w:rPr>
+        <w:t>2:17</w:t>
+      </w:r>
       <w:r>
         <w:rPr>
           <w:rtl/>
@@ -3596,20 +3452,14 @@
         </w:rPr>
         <w:t>: بحسب الشريعة (</w:t>
       </w:r>
-      <w:hyperlink r:id="rId34">
-        <w:r>
-          <w:rPr>
-            <w:rtl/>
-            <w:cs/>
-            <w:lang w:val="ar_AE" w:bidi="ar_AE"/>
-          </w:rPr>
-          <w:rPr>
-            <w:color w:val="0000EE"/>
-            <w:u w:val="single"/>
-          </w:rPr>
-          <w:t>لاويين 25:23–34</w:t>
-        </w:r>
-      </w:hyperlink>
+      <w:r>
+        <w:rPr>
+          <w:rtl/>
+          <w:cs/>
+          <w:lang w:val="ar_AE" w:bidi="ar_AE"/>
+        </w:rPr>
+        <w:t>لاويين 25:23–34</w:t>
+      </w:r>
       <w:r>
         <w:rPr>
           <w:rtl/>
@@ -3701,20 +3551,14 @@
         </w:rPr>
         <w:t xml:space="preserve">). لكن أغلب المترجمين يعتبرون أن الهامش "[أنت] تقتني" هو القراءة الأصلية، للأسباب التالية: (1) الناسخ نفسه ظن أن "[أنت] تقتني" هي القراءة الأصلية. (2) معظم الترجمات القديمة لسفر راعوث – والتي سبقت أقدم المخطوطات العبرية – استعملت أيضًا "[أنت] تقتني". (3) من السهل تصور أن ناسخًا سابقًا قد بدّل "[أنت] تقتني" بـ"[أنا] أقتني" (كما يظهر في </w:t>
       </w:r>
-      <w:hyperlink r:id="rId15">
-        <w:r>
-          <w:rPr>
-            <w:rtl/>
-            <w:cs/>
-            <w:lang w:val="ar_AE" w:bidi="ar_AE"/>
-          </w:rPr>
-          <w:rPr>
-            <w:color w:val="0000EE"/>
-            <w:u w:val="single"/>
-          </w:rPr>
-          <w:t>4:10</w:t>
-        </w:r>
-      </w:hyperlink>
+      <w:r>
+        <w:rPr>
+          <w:rtl/>
+          <w:cs/>
+          <w:lang w:val="ar_AE" w:bidi="ar_AE"/>
+        </w:rPr>
+        <w:t>4:10</w:t>
+      </w:r>
       <w:r>
         <w:rPr>
           <w:rtl/>
@@ -3723,20 +3567,14 @@
         </w:rPr>
         <w:t xml:space="preserve">). • لِتُقِيمَ ٱسْمَ ٱلْمَيِّتِ عَلَى مِيرَاثِهِ: هذه العبارة تستند بشكل كبير إلى </w:t>
       </w:r>
-      <w:hyperlink r:id="rId35">
-        <w:r>
-          <w:rPr>
-            <w:rtl/>
-            <w:cs/>
-            <w:lang w:val="ar_AE" w:bidi="ar_AE"/>
-          </w:rPr>
-          <w:rPr>
-            <w:color w:val="0000EE"/>
-            <w:u w:val="single"/>
-          </w:rPr>
-          <w:t>تثنية 25:7</w:t>
-        </w:r>
-      </w:hyperlink>
+      <w:r>
+        <w:rPr>
+          <w:rtl/>
+          <w:cs/>
+          <w:lang w:val="ar_AE" w:bidi="ar_AE"/>
+        </w:rPr>
+        <w:t>تثنية 25:7</w:t>
+      </w:r>
       <w:r>
         <w:rPr>
           <w:rtl/>
@@ -3777,20 +3615,14 @@
         </w:rPr>
         <w:t xml:space="preserve">) ودور الأخ الذي يتزوج أرملة أخيه المتوفى، حتى يُنجب نسلًا يحمل اسمه (انظر </w:t>
       </w:r>
-      <w:hyperlink r:id="rId36">
-        <w:r>
-          <w:rPr>
-            <w:rtl/>
-            <w:cs/>
-            <w:lang w:val="ar_AE" w:bidi="ar_AE"/>
-          </w:rPr>
-          <w:rPr>
-            <w:color w:val="0000EE"/>
-            <w:u w:val="single"/>
-          </w:rPr>
-          <w:t>تثنية 25:5–10</w:t>
-        </w:r>
-      </w:hyperlink>
+      <w:r>
+        <w:rPr>
+          <w:rtl/>
+          <w:cs/>
+          <w:lang w:val="ar_AE" w:bidi="ar_AE"/>
+        </w:rPr>
+        <w:t>تثنية 25:5–10</w:t>
+      </w:r>
       <w:r>
         <w:rPr>
           <w:i/>
@@ -3808,20 +3640,14 @@
         </w:rPr>
         <w:t xml:space="preserve"> و</w:t>
       </w:r>
-      <w:hyperlink r:id="rId37">
-        <w:r>
-          <w:rPr>
-            <w:rtl/>
-            <w:cs/>
-            <w:lang w:val="ar_AE" w:bidi="ar_AE"/>
-          </w:rPr>
-          <w:rPr>
-            <w:color w:val="0000EE"/>
-            <w:u w:val="single"/>
-          </w:rPr>
-          <w:t>تكوين 38</w:t>
-        </w:r>
-      </w:hyperlink>
+      <w:r>
+        <w:rPr>
+          <w:rtl/>
+          <w:cs/>
+          <w:lang w:val="ar_AE" w:bidi="ar_AE"/>
+        </w:rPr>
+        <w:t>تكوين 38</w:t>
+      </w:r>
       <w:r>
         <w:rPr>
           <w:rtl/>
@@ -3846,20 +3672,14 @@
         </w:rPr>
         <w:t xml:space="preserve">). في فكر شعب إسرائيل القديم، كانت الأرض والنسل متلازمين (قارن </w:t>
       </w:r>
-      <w:hyperlink r:id="rId38">
-        <w:r>
-          <w:rPr>
-            <w:rtl/>
-            <w:cs/>
-            <w:lang w:val="ar_AE" w:bidi="ar_AE"/>
-          </w:rPr>
-          <w:rPr>
-            <w:color w:val="0000EE"/>
-            <w:u w:val="single"/>
-          </w:rPr>
-          <w:t>عدد 27:1–11</w:t>
-        </w:r>
-      </w:hyperlink>
+      <w:r>
+        <w:rPr>
+          <w:rtl/>
+          <w:cs/>
+          <w:lang w:val="ar_AE" w:bidi="ar_AE"/>
+        </w:rPr>
+        <w:t>عدد 27:1–11</w:t>
+      </w:r>
       <w:r>
         <w:rPr>
           <w:rtl/>
@@ -3868,20 +3688,14 @@
         </w:rPr>
         <w:t>). وبما أن نعمي لم تعد قادرة على الإنجاب، فقد كانت راعوث هي الوسيلة لتحقيق هذا الرجاء. هذا التصرف أربك القريب الآخر (</w:t>
       </w:r>
-      <w:hyperlink r:id="rId39">
-        <w:r>
-          <w:rPr>
-            <w:rtl/>
-            <w:cs/>
-            <w:lang w:val="ar_AE" w:bidi="ar_AE"/>
-          </w:rPr>
-          <w:rPr>
-            <w:color w:val="0000EE"/>
-            <w:u w:val="single"/>
-          </w:rPr>
-          <w:t>راعوث 4:6</w:t>
-        </w:r>
-      </w:hyperlink>
+      <w:r>
+        <w:rPr>
+          <w:rtl/>
+          <w:cs/>
+          <w:lang w:val="ar_AE" w:bidi="ar_AE"/>
+        </w:rPr>
+        <w:t>راعوث 4:6</w:t>
+      </w:r>
       <w:r>
         <w:rPr>
           <w:rtl/>
@@ -4064,20 +3878,14 @@
         </w:rPr>
         <w:t xml:space="preserve">وَهَذِهِ هِيَ ٱلْعَادَةُ سَابِقًا: لم يُكتب سفر راعوث في الزمن الذي جرت فيه الأحداث، بل بعد فترة طويلة، حتى إن الناس لم يعودوا يفهمون عادة خلع النعل أو معناها. ففي ذلك الوقت، كان نزع النعل إشارة رمزية لنقل حق شراء الأرض أو فداءها. انظر أيضًا </w:t>
       </w:r>
-      <w:hyperlink r:id="rId40">
-        <w:r>
-          <w:rPr>
-            <w:rtl/>
-            <w:cs/>
-            <w:lang w:val="ar_AE" w:bidi="ar_AE"/>
-          </w:rPr>
-          <w:rPr>
-            <w:color w:val="0000EE"/>
-            <w:u w:val="single"/>
-          </w:rPr>
-          <w:t>تثنية 25:9</w:t>
-        </w:r>
-      </w:hyperlink>
+      <w:r>
+        <w:rPr>
+          <w:rtl/>
+          <w:cs/>
+          <w:lang w:val="ar_AE" w:bidi="ar_AE"/>
+        </w:rPr>
+        <w:t>تثنية 25:9</w:t>
+      </w:r>
       <w:r>
         <w:rPr>
           <w:rtl/>
@@ -4570,20 +4378,14 @@
         </w:rPr>
         <w:t xml:space="preserve">): بولادة عوبيد، امتلأت حياة نعمي من جديد (قارن </w:t>
       </w:r>
-      <w:hyperlink r:id="rId41">
-        <w:r>
-          <w:rPr>
-            <w:rtl/>
-            <w:cs/>
-            <w:lang w:val="ar_AE" w:bidi="ar_AE"/>
-          </w:rPr>
-          <w:rPr>
-            <w:color w:val="0000EE"/>
-            <w:u w:val="single"/>
-          </w:rPr>
-          <w:t>1:21</w:t>
-        </w:r>
-      </w:hyperlink>
+      <w:r>
+        <w:rPr>
+          <w:rtl/>
+          <w:cs/>
+          <w:lang w:val="ar_AE" w:bidi="ar_AE"/>
+        </w:rPr>
+        <w:t>1:21</w:t>
+      </w:r>
       <w:r>
         <w:rPr>
           <w:rtl/>

</xml_diff>